<commit_message>
fix: RGBColor 임포트 복원
</commit_message>
<xml_diff>
--- a/output/내용증명_연신내지역주택조합_분담금반환청구_고영진.docx
+++ b/output/내용증명_연신내지역주택조합_분담금반환청구_고영진.docx
@@ -179,7 +179,257 @@
           <w:b/>
           <w:sz w:val="24"/>
         </w:rPr>
-        <w:t>2. 사실관계</w:t>
+        <w:t>2. 본 사안의 기본 사실관계 및 입증자료 (요약)</w:t>
+      </w:r>
+    </w:p>
+    <w:p>
+      <w:pPr>
+        <w:spacing w:after="40" w:line="336" w:lineRule="auto"/>
+        <w:ind w:left="283"/>
+      </w:pPr>
+      <w:r>
+        <w:rPr>
+          <w:rFonts w:ascii="맑은 고딕" w:hAnsi="맑은 고딕" w:eastAsia="맑은 고딕"/>
+          <w:b/>
+          <w:sz w:val="22"/>
+        </w:rPr>
+        <w:t>■ 녹음 기본정보</w:t>
+      </w:r>
+    </w:p>
+    <w:p>
+      <w:pPr>
+        <w:spacing w:after="160" w:line="336" w:lineRule="auto"/>
+        <w:ind w:left="510"/>
+      </w:pPr>
+      <w:r>
+        <w:rPr>
+          <w:rFonts w:ascii="맑은 고딕" w:hAnsi="맑은 고딕" w:eastAsia="맑은 고딕"/>
+          <w:b w:val="0"/>
+          <w:sz w:val="20"/>
+        </w:rPr>
+        <w:t>· 녹음 일시 : 2023년 3월 15일 (수)</w:t>
+        <w:br/>
+        <w:t>· 녹음 장소 : (가칭)연신내지역주택조합 추진위원회 사무실 (서울 은평구 통일로 80길 17-7, 불광동)</w:t>
+        <w:br/>
+        <w:t>· 녹음 시간 : 총 47분 53초</w:t>
+        <w:br/>
+        <w:t>· 면담자  : 갑 ─ 통고인 고영진  /  을 ─ 주식회사 다원에코코리아 업무대행총괄 김성수(金成洙) 이사</w:t>
+        <w:br/>
+        <w:t>· 녹음 매체 : 통고인 휴대전화 음성녹음 (원본 파일 보관 중)</w:t>
+      </w:r>
+    </w:p>
+    <w:p>
+      <w:pPr>
+        <w:spacing w:after="40" w:line="336" w:lineRule="auto"/>
+        <w:ind w:left="283"/>
+      </w:pPr>
+      <w:r>
+        <w:rPr>
+          <w:rFonts w:ascii="맑은 고딕" w:hAnsi="맑은 고딕" w:eastAsia="맑은 고딕"/>
+          <w:b/>
+          <w:sz w:val="22"/>
+        </w:rPr>
+        <w:t>■ 녹취록으로 객관적으로 확인되는 핵심 사실</w:t>
+      </w:r>
+    </w:p>
+    <w:p>
+      <w:pPr>
+        <w:spacing w:after="160" w:line="336" w:lineRule="auto"/>
+        <w:ind w:left="510"/>
+      </w:pPr>
+      <w:r>
+        <w:rPr>
+          <w:rFonts w:ascii="맑은 고딕" w:hAnsi="맑은 고딕" w:eastAsia="맑은 고딕"/>
+          <w:b w:val="0"/>
+          <w:sz w:val="20"/>
+        </w:rPr>
+        <w:t>1) 통고인은 2019년 12월경 1·2차 조합원 모집 시 25평형으로 가입하고, 그 이후 분담금 등 명목으로 총 90,000,000원(구천만 원)을 납입하였음.</w:t>
+        <w:br/>
+        <w:t>2) 2023.3.15. 통고인이 조합원 탈퇴서에 자필 서명·날인하여 김성수 이사에게 직접 교부함으로써 동 일자로 가입계약은 적법하게 해지(탈퇴) 종국적 완료됨.</w:t>
+        <w:br/>
+        <w:t>3) 김성수 이사는 그 자리에서 ‘해지가 됐으니 2,500만 원 공제한 6,500만 원을 대체 조합원 모집 시(2024년 3월 ~ 8월 중) 반환하겠다’고 명시적으로 자인함.</w:t>
+        <w:br/>
+        <w:t>4) 위 자인된 환불 시기(2024.3.~8.)는 이미 도과하였음에도 귀 조합·업무대행사는 일체의 환불을 이행하지 아니하여 이행지체가 명백함.</w:t>
+        <w:br/>
+        <w:t>5) 김성수 이사는 분담금이 본래 목적인 토지 매입이 아닌 ‘홍보관 운영 등 부대비용’으로 임의 전용·소진되었음을 직접 자인함.</w:t>
+        <w:br/>
+        <w:t>6) 가입 당시 모집공고문상 약속(2022.6.까지 토지매매계약 약 95% 완료)과 비교하여, 실제 매입률은 약 8%에 불과하여 약 87%포인트의 중대한 미달이 객관적으로 확인됨.</w:t>
+      </w:r>
+    </w:p>
+    <w:p>
+      <w:pPr>
+        <w:spacing w:after="40" w:line="336" w:lineRule="auto"/>
+        <w:ind w:left="283"/>
+      </w:pPr>
+      <w:r>
+        <w:rPr>
+          <w:rFonts w:ascii="맑은 고딕" w:hAnsi="맑은 고딕" w:eastAsia="맑은 고딕"/>
+          <w:b/>
+          <w:sz w:val="22"/>
+        </w:rPr>
+        <w:t>■ 김성수 이사의 결정적 자인(自認) 발언 — 녹취록 발췌</w:t>
+      </w:r>
+    </w:p>
+    <w:p>
+      <w:pPr>
+        <w:spacing w:after="0" w:line="336" w:lineRule="auto"/>
+        <w:ind w:left="510"/>
+      </w:pPr>
+      <w:r>
+        <w:rPr>
+          <w:rFonts w:ascii="맑은 고딕" w:hAnsi="맑은 고딕" w:eastAsia="맑은 고딕"/>
+          <w:b/>
+          <w:color w:val="C00000"/>
+          <w:sz w:val="20"/>
+        </w:rPr>
+        <w:t>[28:02] 김성수 이사 :</w:t>
+      </w:r>
+    </w:p>
+    <w:p>
+      <w:pPr>
+        <w:spacing w:after="80" w:line="336" w:lineRule="auto"/>
+        <w:ind w:left="850"/>
+      </w:pPr>
+      <w:r>
+        <w:rPr>
+          <w:rFonts w:ascii="맑은 고딕" w:hAnsi="맑은 고딕" w:eastAsia="맑은 고딕"/>
+          <w:b w:val="0"/>
+          <w:sz w:val="20"/>
+        </w:rPr>
+        <w:t>“그렇죠. 해지 통보가 가면, 저희가 조합 규약에 의해서 ‘이렇게 해지가 됐으니 대체 조합원 모집 시 2,500만 원 공제한 6,500만 원을 돌려주겠다, 다음 주에 드리겠다’라는 통보가 가죠.”</w:t>
+      </w:r>
+    </w:p>
+    <w:p>
+      <w:pPr>
+        <w:spacing w:after="0" w:line="336" w:lineRule="auto"/>
+        <w:ind w:left="510"/>
+      </w:pPr>
+      <w:r>
+        <w:rPr>
+          <w:rFonts w:ascii="맑은 고딕" w:hAnsi="맑은 고딕" w:eastAsia="맑은 고딕"/>
+          <w:b/>
+          <w:color w:val="C00000"/>
+          <w:sz w:val="20"/>
+        </w:rPr>
+        <w:t>[25:17] 김성수 이사 :</w:t>
+      </w:r>
+    </w:p>
+    <w:p>
+      <w:pPr>
+        <w:spacing w:after="80" w:line="336" w:lineRule="auto"/>
+        <w:ind w:left="850"/>
+      </w:pPr>
+      <w:r>
+        <w:rPr>
+          <w:rFonts w:ascii="맑은 고딕" w:hAnsi="맑은 고딕" w:eastAsia="맑은 고딕"/>
+          <w:b w:val="0"/>
+          <w:sz w:val="20"/>
+        </w:rPr>
+        <w:t>“3월에서 6월에서 8월 사이에, 대체 조합원이 모집될 때. 저희가 지금 대체 조합원을 모집을 못 하잖아요.”  → 환불 시기 자인. 동 시기는 이미 도과.</w:t>
+      </w:r>
+    </w:p>
+    <w:p>
+      <w:pPr>
+        <w:spacing w:after="0" w:line="336" w:lineRule="auto"/>
+        <w:ind w:left="510"/>
+      </w:pPr>
+      <w:r>
+        <w:rPr>
+          <w:rFonts w:ascii="맑은 고딕" w:hAnsi="맑은 고딕" w:eastAsia="맑은 고딕"/>
+          <w:b/>
+          <w:color w:val="C00000"/>
+          <w:sz w:val="20"/>
+        </w:rPr>
+        <w:t>[15:48] 김성수 이사 :</w:t>
+      </w:r>
+    </w:p>
+    <w:p>
+      <w:pPr>
+        <w:spacing w:after="80" w:line="336" w:lineRule="auto"/>
+        <w:ind w:left="850"/>
+      </w:pPr>
+      <w:r>
+        <w:rPr>
+          <w:rFonts w:ascii="맑은 고딕" w:hAnsi="맑은 고딕" w:eastAsia="맑은 고딕"/>
+          <w:b w:val="0"/>
+          <w:sz w:val="20"/>
+        </w:rPr>
+        <w:t>“그러면서 경비는 저 홍보관을 계속 열어놨어야 되니까… 땅을 좀 더 살 수 있는 돈이 저기(홍보관 등)로 소모가 좀 된 거고…”  → 분담금의 본래 목적 외 임의 전용 자인.</w:t>
+      </w:r>
+    </w:p>
+    <w:p>
+      <w:pPr>
+        <w:spacing w:after="0" w:line="336" w:lineRule="auto"/>
+        <w:ind w:left="510"/>
+      </w:pPr>
+      <w:r>
+        <w:rPr>
+          <w:rFonts w:ascii="맑은 고딕" w:hAnsi="맑은 고딕" w:eastAsia="맑은 고딕"/>
+          <w:b/>
+          <w:color w:val="C00000"/>
+          <w:sz w:val="20"/>
+        </w:rPr>
+        <w:t>[46:33 ~ 46:40] 김성수 이사 :</w:t>
+      </w:r>
+    </w:p>
+    <w:p>
+      <w:pPr>
+        <w:spacing w:after="80" w:line="336" w:lineRule="auto"/>
+        <w:ind w:left="850"/>
+      </w:pPr>
+      <w:r>
+        <w:rPr>
+          <w:rFonts w:ascii="맑은 고딕" w:hAnsi="맑은 고딕" w:eastAsia="맑은 고딕"/>
+          <w:b w:val="0"/>
+          <w:sz w:val="20"/>
+        </w:rPr>
+        <w:t>“그게 계약서에 그렇게 되어 있잖아요. 분담금을 내라는 게 아니라 ‘중도금’이죠. 중도금은 어차피 내는 거예요… 자비로 내는 것에 대한 ‘총회’를 한 거예요.”</w:t>
+        <w:br/>
+        <w:t>→ ‘착공 후’ 분담금 납부 조항을 인지하면서도 총회 결의로 일방 변경하였음을 자인.</w:t>
+      </w:r>
+    </w:p>
+    <w:p>
+      <w:pPr>
+        <w:spacing w:after="0" w:line="336" w:lineRule="auto"/>
+        <w:ind w:left="510"/>
+      </w:pPr>
+      <w:r>
+        <w:rPr>
+          <w:rFonts w:ascii="맑은 고딕" w:hAnsi="맑은 고딕" w:eastAsia="맑은 고딕"/>
+          <w:b/>
+          <w:color w:val="C00000"/>
+          <w:sz w:val="20"/>
+        </w:rPr>
+        <w:t>[27:51 ~ 28:02] 김성수 이사 (해지 절차 안내) :</w:t>
+      </w:r>
+    </w:p>
+    <w:p>
+      <w:pPr>
+        <w:spacing w:after="240" w:line="336" w:lineRule="auto"/>
+        <w:ind w:left="850"/>
+      </w:pPr>
+      <w:r>
+        <w:rPr>
+          <w:rFonts w:ascii="맑은 고딕" w:hAnsi="맑은 고딕" w:eastAsia="맑은 고딕"/>
+          <w:b w:val="0"/>
+          <w:sz w:val="20"/>
+        </w:rPr>
+        <w:t>“독촉장이 3번이 가요. (… 그러면 …) 해지 통보를 해요. 그렇죠.”</w:t>
+        <w:br/>
+        <w:t>→ 통고인의 탈퇴를 정당한 해지 절차로 인정하는 발언.</w:t>
+      </w:r>
+    </w:p>
+    <w:p>
+      <w:pPr>
+        <w:spacing w:after="120" w:line="336" w:lineRule="auto"/>
+      </w:pPr>
+      <w:r>
+        <w:rPr>
+          <w:rFonts w:ascii="맑은 고딕" w:hAnsi="맑은 고딕" w:eastAsia="맑은 고딕"/>
+          <w:b/>
+          <w:sz w:val="24"/>
+        </w:rPr>
+        <w:t>3. 구체적 사실관계</w:t>
       </w:r>
     </w:p>
     <w:p>
@@ -221,7 +471,7 @@
           <w:b w:val="0"/>
           <w:sz w:val="22"/>
         </w:rPr>
-        <w:t>다. 그럼에도 귀 조합은 통고인이 명시적으로 반대 의사를 표명한 추가분담금 4,000만 원(2,000만 원 × 2회 분납)을 본인에게 청구하고 있으며, 이는 통고인이 체결한 가입계약서 분담금 납부 시기 조항(‘착공 후 분담금 납부’)에 정면으로 반하는 것입니다.</w:t>
+        <w:t>다. (탈퇴 사유 — 이미 종결된 위법한 추가청구) 통고인의 탈퇴 직전, 귀 조합 및 그 업무대행사는 통고인이 명시적으로 반대 의사를 표명하였음에도 추가분담금 4,000만 원(2,000만 원 × 2회 분납)을 청구한 사실이 있고, 이는 통고인의 가입계약서상 ‘착공 후 분담금 납부’ 조항에 정면으로 반하는 위법한 청구로서, 통고인이 2023.3.15.자 탈퇴를 결행한 직접적 사유였습니다. (현 시점에서는 통고인이 이미 탈퇴를 완료한 이상 위 추가청구 자체는 본 사안의 주된 쟁점이 아니며, 본 최고서는 ‘이미 발생한 환불 채무의 이행’에 관한 것임을 분명히 밝혀둡니다.)</w:t>
       </w:r>
     </w:p>
     <w:p>
@@ -249,7 +499,7 @@
           <w:b w:val="0"/>
           <w:sz w:val="22"/>
         </w:rPr>
-        <w:t>마. 그러나 귀 조합은 위 해지일(2023.3.15.)로부터 본 최고서 발송일 현재까지 약 3년 2개월이 경과하였음에도, 위 6,500만 원조차 일체 반환하지 아니하고 있으며, 조합이 임의로 약속하였던 ‘2024년 3월~8월 대체 조합원 모집 시’라는 시기도 이미 도과한 상태로 ‘이행지체’가 명백합니다.</w:t>
+        <w:t>마. (현재 상태 ─ 본 사안의 핵심) 위 해지일(2023.3.15.)로부터 본 최고서 발송일 현재까지 약 3년 2개월이 경과하였습니다. 그동안 귀 조합·업무대행사는 통고인에게 추가분담금을 더 이상 청구하지 아니하면서도, 정작 통고인이 정당하게 청구할 권리가 있는 분담금 환급에 관하여는 — 김성수 이사가 직접 자인한 6,500만 원조차 — 어떠한 이행도 하지 아니한 채, 귀 조합이 임의로 약속하였던 환불 시기(2024년 3월~8월 대체 조합원 모집 시)마저 무위로 도과시킨 상태입니다. 이는 정당한 사유 없는 명백한 이행지체로서, 통고인은 더 이상의 시간 지연 또는 여하한 변명을 수인할 의무가 없음을 분명히 합니다.</w:t>
       </w:r>
     </w:p>
     <w:p>
@@ -262,7 +512,7 @@
           <w:b/>
           <w:sz w:val="24"/>
         </w:rPr>
-        <w:t>3. 통고인의 법적 주장</w:t>
+        <w:t>4. 통고인의 법적 주장</w:t>
       </w:r>
     </w:p>
     <w:p>
@@ -457,7 +707,7 @@
           <w:b/>
           <w:sz w:val="24"/>
         </w:rPr>
-        <w:t>4. 구체적 청구</w:t>
+        <w:t>5. 구체적 청구</w:t>
       </w:r>
     </w:p>
     <w:p>
@@ -526,7 +776,7 @@
           <w:b/>
           <w:sz w:val="24"/>
         </w:rPr>
-        <w:t>5. 미이행 시 조치 예고</w:t>
+        <w:t>6. 미이행 시 조치 예고</w:t>
       </w:r>
     </w:p>
     <w:p>

</xml_diff>